<commit_message>
Chinese version: report NMC result from the original implementation
Replace the re-implementation's null NMC result with the original
implementation's waveform increment (-0.163 pp, 39/44), add the
absolute-voltage-level explanation of the discrepancy to Section 4.6 and
Note S6, extend Table S7, and log the update in the revision notes.
English files are unchanged.

Co-Authored-By: Claude Opus 5.5 <noreply@anthropic.com>
Claude-Session: https://claude.ai/code/session_011wQfVcjqSLDCo2NCokAy4g
</commit_message>
<xml_diff>
--- a/manuscript/zh/LFP_SOH_PulseFusion_Supplementary_ZH.docx
+++ b/manuscript/zh/LFP_SOH_PulseFusion_Supplementary_ZH.docx
@@ -10220,7 +10220,7 @@
         <w:pStyle w:val="FirstParagraph"/>
       </w:pPr>
       <w:r>
-        <w:t xml:space="preserve">4.6节的实验采用以Python编写的、对本文协议的独立复现实现完成（NumPy、scikit-learn 1.9和PyTorch 2.14，在CPU上运行，每次运行单线程），以数据发布方处理后的脉冲文件[31]为起点。清洗结果与原记录数完全一致：清洗前2,855个组共17,130条记录，第42次RPT处剔除192条记录，清洗后2,823个完整组共16,938条记录（SOH 72.34～100%）。143项波形特征按补充说明S1的定义实现；这些定义未规定的细节（如全局波形量的分位水平以及补充说明S1中未列出的9项电压差）可能与原代码不同，响应时间水平取0.5、0.632和0.9。尽管如此，特征筛选结果相近：第0折选出16项频域与小波量、14项分段统计量、11项差分动力学量、6项全局波形量、1项瞬态边界量和1项非线性复杂度量，以及排在第13位的直流内阻；44项特征在每折中均入选，57项至少在一折中入选。划分置换使用NumPy默认随机数发生器（种子42），可复现各折的规模，但不一定复现原运行中各折的电芯构成。网络结构、损失函数、优化器、学习率调度、早停与初始化种子均沿用正文3.2～3.4节，位置嵌入按U(−0.02, 0.02)初始化。</w:t>
+        <w:t xml:space="preserve">4.6节中除NMC/石墨数据集主结果外的实验均采用以Python编写的、对本文协议的独立复现实现完成（NumPy、scikit-learn 1.9和PyTorch 2.14，在CPU上运行，每次运行单线程），以数据发布方处理后的脉冲文件[31]为起点。清洗结果与原记录数完全一致：清洗前2,855个组共17,130条记录，第42次RPT处剔除192条记录，清洗后2,823个完整组共16,938条记录（SOH 72.34～100%）。143项波形特征按补充说明S1的定义实现；这些定义未规定的细节（如全局波形量的分位水平以及补充说明S1中未列出的9项电压差）可能与原代码不同，响应时间水平取0.5、0.632和0.9。尽管如此，特征筛选结果相近：第0折选出16项频域与小波量、14项分段统计量、11项差分动力学量、6项全局波形量、1项瞬态边界量和1项非线性复杂度量，以及排在第13位的直流内阻；44项特征在每折中均入选，57项至少在一折中入选。划分置换使用NumPy默认随机数发生器（种子42），可复现各折的规模，但不一定复现原运行中各折的电芯构成。网络结构、损失函数、优化器、学习率调度、早停与初始化种子均沿用正文3.2～3.4节，位置嵌入按U(−0.02, 0.02)初始化。</w:t>
       </w:r>
     </w:p>
     <w:p>
@@ -10306,7 +10306,33 @@
         <w:t xml:space="preserve">NMC/石墨数据集。</w:t>
       </w:r>
       <w:r>
-        <w:t xml:space="preserve">UConn-ILCC NMC数据集[31]在9个名义SOC下记录了相同的100 s脉冲；本文保留LFP所用的3个SOC（20%、50%和90%），每个RPT对应6种工况，共得到44个电芯的1,336个电芯–RPT组、8,016条记录，SOH范围为41.2%～100%。由于NMC电芯的内阻较高，式（2）中的电压单步跳变上限和极差上限分别放宽至0.3 V和0.8 V，未剔除任何记录；流程的其余部分保持不变。在该数据上，两种神经网络模型表现相当（R0为2.030个百分点，A2为2.026个百分点；R0 − A2 = +0.004个百分点，区间−0.042～0.047；</w:t>
+        <w:t xml:space="preserve">UConn-ILCC NMC数据集[31]在9个名义SOC下记录了相同的100 s脉冲；本文保留LFP所用的3个SOC（20%、50%和90%），每个RPT对应6种工况，共得到44个电芯的1,336个电芯–RPT组、8,016条记录，SOH范围为41.2%～100%。由于NMC电芯的内阻较高，式（2）中的电压单步跳变上限和极差上限分别放宽至0.3 V和0.8 V，未剔除任何记录。正文结果由原实现得到（5折×3个种子，</w:t>
+      </w:r>
+      <w:r>
+        <w:rPr>
+          <w:i/>
+          <w:iCs/>
+        </w:rPr>
+        <w:t xml:space="preserve">K</w:t>
+      </w:r>
+      <w:r>
+        <w:t xml:space="preserve"> </w:t>
+      </w:r>
+      <w:r>
+        <w:t xml:space="preserve">= 50，</w:t>
+      </w:r>
+      <w:r>
+        <w:rPr>
+          <w:i/>
+          <w:iCs/>
+        </w:rPr>
+        <w:t xml:space="preserve">λ</w:t>
+      </w:r>
+      <w:r>
+        <w:t xml:space="preserve"> </w:t>
+      </w:r>
+      <w:r>
+        <w:t xml:space="preserve">= 0.1，与LFP相同）：R0为1.968个百分点，A2为2.132个百分点，R0 − A2 = −0.163个百分点（Holm校正后</w:t>
       </w:r>
       <w:r>
         <w:rPr>
@@ -10319,7 +10345,84 @@
         <w:t xml:space="preserve"> </w:t>
       </w:r>
       <w:r>
-        <w:t xml:space="preserve">= 0.90），均明显优于A1（2.317个百分点）；GBDT达到0.935个百分点，且在每个SOH区间内都比神经网络模型更准确。</w:t>
+        <w:t xml:space="preserve">= 0.0004，39/44），A1为2.468个百分点，GBDT为0.965个百分点。直流内阻与SOH高度相关（</w:t>
+      </w:r>
+      <w:r>
+        <w:rPr>
+          <w:i/>
+          <w:iCs/>
+        </w:rPr>
+        <w:t xml:space="preserve">ρ</w:t>
+      </w:r>
+      <w:r>
+        <w:t xml:space="preserve"> </w:t>
+      </w:r>
+      <w:r>
+        <w:t xml:space="preserve">≈ −0.82），但因与已选波形特征冗余而未进入任何一折的50项特征，因此A1按其定义单独加入直流内阻；R0、A2与GBDT均按原流程运行。</w:t>
+      </w:r>
+    </w:p>
+    <w:p>
+      <w:pPr>
+        <w:pStyle w:val="BodyText"/>
+      </w:pPr>
+      <w:r>
+        <w:rPr>
+          <w:i/>
+          <w:iCs/>
+        </w:rPr>
+        <w:t xml:space="preserve">复现实现与原实现的差异。</w:t>
+      </w:r>
+      <w:r>
+        <w:t xml:space="preserve">复现实现在NMC上未得到波形增量（R0为2.030个百分点，A2为2.026个百分点，R0 − A2 = +0.004个百分点，</w:t>
+      </w:r>
+      <w:r>
+        <w:rPr>
+          <w:i/>
+          <w:iCs/>
+        </w:rPr>
+        <w:t xml:space="preserve">p</w:t>
+      </w:r>
+      <w:r>
+        <w:t xml:space="preserve"> </w:t>
+      </w:r>
+      <w:r>
+        <w:t xml:space="preserve">= 0.90）。诊断分析表明，差异来自主干特征：复现实现的特征在绝对电压上计算，在NMC上会选入脉冲前电压、末点电压、电压分位数等绝对电压水平特征（第0折6项，LFP上基本不选）。NMC开路电压曲线具有斜率，容量衰减使脉冲时的实际SOC偏离名义值，脉冲前电压与SOH的相关系数绝对值平均为0.93（LFP为0.36），由脉冲前电压预测实际SOC偏移的</w:t>
+      </w:r>
+      <w:r>
+        <w:rPr>
+          <w:i/>
+          <w:iCs/>
+        </w:rPr>
+        <w:t xml:space="preserve">R</w:t>
+      </w:r>
+      <w:r>
+        <w:t xml:space="preserve">²为0.964（LFP为0.489）。主干已经获得这部分信息时，波形分支的动态信息与之部分重叠：在每种脉冲工况内，所选特征可解释ΔV前10个主成分方差的99.4%（LFP为18.3%）。将28项绝对电压水平特征从候选特征中移除后，复现实现的A2为2.098个百分点，R0为1.940个百分点，R0 − A2 = −0.158个百分点（−0.205～−0.112，</w:t>
+      </w:r>
+      <w:r>
+        <w:rPr>
+          <w:i/>
+          <w:iCs/>
+        </w:rPr>
+        <w:t xml:space="preserve">p</w:t>
+      </w:r>
+      <w:r>
+        <w:t xml:space="preserve"> </w:t>
+      </w:r>
+      <w:r>
+        <w:t xml:space="preserve">&lt; 0.001，36/44），与原实现一致。改用全部9个SOC（24,048条记录）不改变复现实现的结论（R0 − A2 = +0.017个百分点，</w:t>
+      </w:r>
+      <w:r>
+        <w:rPr>
+          <w:i/>
+          <w:iCs/>
+        </w:rPr>
+        <w:t xml:space="preserve">p</w:t>
+      </w:r>
+      <w:r>
+        <w:t xml:space="preserve"> </w:t>
+      </w:r>
+      <w:r>
+        <w:t xml:space="preserve">= 0.67），说明差异并非数据量所致。</w:t>
       </w:r>
     </w:p>
     <w:p>
@@ -21382,7 +21485,7 @@
       </w:r>
       <w:r>
         <w:rPr/>
-        <w:t xml:space="preserve">复现实现的结果（电芯宏平均RMSE，SOH百分点）</w:t>
+        <w:t xml:space="preserve">补充实验结果（电芯宏平均RMSE，SOH百分点）</w:t>
       </w:r>
     </w:p>
     <w:tbl>
@@ -21396,7 +21499,7 @@
           <w:bottom w:w="15" w:type="dxa"/>
           <w:right w:w="60" w:type="dxa"/>
         </w:tblCellMar>
-        <w:tblCaption w:val="补充表S7 复现实现的结果（电芯宏平均RMSE，SOH百分点）"/>
+        <w:tblCaption w:val="补充表S7 补充实验结果（电芯宏平均RMSE，SOH百分点）"/>
       </w:tblPr>
       <w:tblGrid>
         <w:gridCol w:w="1697"/>
@@ -23188,6 +23291,390 @@
         </w:trPr>
         <w:tc>
           <w:tcPr>
+            <w:tcBorders/>
+            <w:vAlign w:val="center"/>
+          </w:tcPr>
+          <w:p>
+            <w:pPr>
+              <w:pStyle w:val="TableText"/>
+              <w:jc w:val="left"/>
+            </w:pPr>
+            <w:r>
+              <w:rPr>
+                <w:noProof/>
+              </w:rPr>
+              <w:t xml:space="preserve">五折，原实现</w:t>
+            </w:r>
+            <w:r>
+              <w:rPr>
+                <w:noProof/>
+                <w:vertAlign w:val="superscript"/>
+              </w:rPr>
+              <w:t xml:space="preserve">b</w:t>
+            </w:r>
+          </w:p>
+        </w:tc>
+        <w:tc>
+          <w:tcPr>
+            <w:tcBorders/>
+            <w:vAlign w:val="center"/>
+          </w:tcPr>
+          <w:p>
+            <w:pPr>
+              <w:pStyle w:val="TableText"/>
+              <w:jc w:val="left"/>
+            </w:pPr>
+            <w:r>
+              <w:rPr>
+                <w:noProof/>
+              </w:rPr>
+              <w:t xml:space="preserve">NMC</w:t>
+            </w:r>
+          </w:p>
+        </w:tc>
+        <w:tc>
+          <w:tcPr>
+            <w:tcBorders/>
+            <w:vAlign w:val="center"/>
+          </w:tcPr>
+          <w:p>
+            <w:pPr>
+              <w:pStyle w:val="TableText"/>
+              <w:jc w:val="right"/>
+            </w:pPr>
+            <w:r>
+              <w:rPr>
+                <w:noProof/>
+              </w:rPr>
+              <w:t xml:space="preserve">1.968</w:t>
+            </w:r>
+          </w:p>
+        </w:tc>
+        <w:tc>
+          <w:tcPr>
+            <w:tcBorders/>
+            <w:vAlign w:val="center"/>
+          </w:tcPr>
+          <w:p>
+            <w:pPr>
+              <w:pStyle w:val="TableText"/>
+              <w:jc w:val="right"/>
+            </w:pPr>
+            <w:r>
+              <w:rPr>
+                <w:noProof/>
+              </w:rPr>
+              <w:t xml:space="preserve">2.132</w:t>
+            </w:r>
+          </w:p>
+        </w:tc>
+        <w:tc>
+          <w:tcPr>
+            <w:tcBorders/>
+            <w:vAlign w:val="center"/>
+          </w:tcPr>
+          <w:p>
+            <w:pPr>
+              <w:pStyle w:val="TableText"/>
+              <w:jc w:val="right"/>
+            </w:pPr>
+            <w:r>
+              <w:rPr>
+                <w:noProof/>
+              </w:rPr>
+              <w:t xml:space="preserve">2.468</w:t>
+            </w:r>
+          </w:p>
+        </w:tc>
+        <w:tc>
+          <w:tcPr>
+            <w:tcBorders/>
+            <w:vAlign w:val="center"/>
+          </w:tcPr>
+          <w:p>
+            <w:pPr>
+              <w:pStyle w:val="TableText"/>
+              <w:jc w:val="right"/>
+            </w:pPr>
+            <w:r>
+              <w:rPr>
+                <w:noProof/>
+              </w:rPr>
+              <w:t xml:space="preserve">0.965</w:t>
+            </w:r>
+          </w:p>
+        </w:tc>
+        <w:tc>
+          <w:tcPr>
+            <w:tcBorders/>
+            <w:vAlign w:val="center"/>
+          </w:tcPr>
+          <w:p>
+            <w:pPr>
+              <w:pStyle w:val="TableText"/>
+              <w:jc w:val="right"/>
+            </w:pPr>
+            <w:r>
+              <w:rPr>
+                <w:noProof/>
+              </w:rPr>
+              <w:t xml:space="preserve">−0.163</w:t>
+            </w:r>
+          </w:p>
+        </w:tc>
+        <w:tc>
+          <w:tcPr>
+            <w:tcBorders/>
+            <w:vAlign w:val="center"/>
+          </w:tcPr>
+          <w:p>
+            <w:pPr>
+              <w:pStyle w:val="TableText"/>
+              <w:jc w:val="left"/>
+            </w:pPr>
+            <w:r>
+              <w:rPr>
+                <w:noProof/>
+              </w:rPr>
+              <w:t xml:space="preserve">待补</w:t>
+            </w:r>
+          </w:p>
+        </w:tc>
+        <w:tc>
+          <w:tcPr>
+            <w:tcBorders/>
+            <w:vAlign w:val="center"/>
+          </w:tcPr>
+          <w:p>
+            <w:pPr>
+              <w:pStyle w:val="TableText"/>
+              <w:jc w:val="right"/>
+            </w:pPr>
+            <w:r>
+              <w:rPr>
+                <w:noProof/>
+              </w:rPr>
+              <w:t xml:space="preserve">0.0004</w:t>
+            </w:r>
+            <w:r>
+              <w:rPr>
+                <w:noProof/>
+                <w:vertAlign w:val="superscript"/>
+              </w:rPr>
+              <w:t xml:space="preserve">c</w:t>
+            </w:r>
+          </w:p>
+        </w:tc>
+        <w:tc>
+          <w:tcPr>
+            <w:tcBorders/>
+            <w:vAlign w:val="center"/>
+          </w:tcPr>
+          <w:p>
+            <w:pPr>
+              <w:pStyle w:val="TableText"/>
+              <w:jc w:val="right"/>
+            </w:pPr>
+            <w:r>
+              <w:rPr>
+                <w:noProof/>
+              </w:rPr>
+              <w:t xml:space="preserve">39/44</w:t>
+            </w:r>
+          </w:p>
+        </w:tc>
+      </w:tr>
+      <w:tr>
+        <w:trPr>
+          <w:cantSplit/>
+        </w:trPr>
+        <w:tc>
+          <w:tcPr>
+            <w:tcBorders/>
+            <w:vAlign w:val="center"/>
+          </w:tcPr>
+          <w:p>
+            <w:pPr>
+              <w:pStyle w:val="TableText"/>
+              <w:jc w:val="left"/>
+            </w:pPr>
+            <w:r>
+              <w:rPr>
+                <w:noProof/>
+              </w:rPr>
+              <w:t xml:space="preserve">五折，复现实现</w:t>
+            </w:r>
+          </w:p>
+        </w:tc>
+        <w:tc>
+          <w:tcPr>
+            <w:tcBorders/>
+            <w:vAlign w:val="center"/>
+          </w:tcPr>
+          <w:p>
+            <w:pPr>
+              <w:pStyle w:val="TableText"/>
+              <w:jc w:val="left"/>
+            </w:pPr>
+            <w:r>
+              <w:rPr>
+                <w:noProof/>
+              </w:rPr>
+              <w:t xml:space="preserve">NMC</w:t>
+            </w:r>
+          </w:p>
+        </w:tc>
+        <w:tc>
+          <w:tcPr>
+            <w:tcBorders/>
+            <w:vAlign w:val="center"/>
+          </w:tcPr>
+          <w:p>
+            <w:pPr>
+              <w:pStyle w:val="TableText"/>
+              <w:jc w:val="right"/>
+            </w:pPr>
+            <w:r>
+              <w:rPr>
+                <w:noProof/>
+              </w:rPr>
+              <w:t xml:space="preserve">2.030</w:t>
+            </w:r>
+          </w:p>
+        </w:tc>
+        <w:tc>
+          <w:tcPr>
+            <w:tcBorders/>
+            <w:vAlign w:val="center"/>
+          </w:tcPr>
+          <w:p>
+            <w:pPr>
+              <w:pStyle w:val="TableText"/>
+              <w:jc w:val="right"/>
+            </w:pPr>
+            <w:r>
+              <w:rPr>
+                <w:noProof/>
+              </w:rPr>
+              <w:t xml:space="preserve">2.026</w:t>
+            </w:r>
+          </w:p>
+        </w:tc>
+        <w:tc>
+          <w:tcPr>
+            <w:tcBorders/>
+            <w:vAlign w:val="center"/>
+          </w:tcPr>
+          <w:p>
+            <w:pPr>
+              <w:pStyle w:val="TableText"/>
+              <w:jc w:val="right"/>
+            </w:pPr>
+            <w:r>
+              <w:rPr>
+                <w:noProof/>
+              </w:rPr>
+              <w:t xml:space="preserve">2.317</w:t>
+            </w:r>
+          </w:p>
+        </w:tc>
+        <w:tc>
+          <w:tcPr>
+            <w:tcBorders/>
+            <w:vAlign w:val="center"/>
+          </w:tcPr>
+          <w:p>
+            <w:pPr>
+              <w:pStyle w:val="TableText"/>
+              <w:jc w:val="right"/>
+            </w:pPr>
+            <w:r>
+              <w:rPr>
+                <w:noProof/>
+              </w:rPr>
+              <w:t xml:space="preserve">0.935</w:t>
+            </w:r>
+          </w:p>
+        </w:tc>
+        <w:tc>
+          <w:tcPr>
+            <w:tcBorders/>
+            <w:vAlign w:val="center"/>
+          </w:tcPr>
+          <w:p>
+            <w:pPr>
+              <w:pStyle w:val="TableText"/>
+              <w:jc w:val="right"/>
+            </w:pPr>
+            <w:r>
+              <w:rPr>
+                <w:noProof/>
+              </w:rPr>
+              <w:t xml:space="preserve">+0.004</w:t>
+            </w:r>
+          </w:p>
+        </w:tc>
+        <w:tc>
+          <w:tcPr>
+            <w:tcBorders/>
+            <w:vAlign w:val="center"/>
+          </w:tcPr>
+          <w:p>
+            <w:pPr>
+              <w:pStyle w:val="TableText"/>
+              <w:jc w:val="left"/>
+            </w:pPr>
+            <w:r>
+              <w:rPr>
+                <w:noProof/>
+              </w:rPr>
+              <w:t xml:space="preserve">−0.042～0.047</w:t>
+            </w:r>
+          </w:p>
+        </w:tc>
+        <w:tc>
+          <w:tcPr>
+            <w:tcBorders/>
+            <w:vAlign w:val="center"/>
+          </w:tcPr>
+          <w:p>
+            <w:pPr>
+              <w:pStyle w:val="TableText"/>
+              <w:jc w:val="right"/>
+            </w:pPr>
+            <w:r>
+              <w:rPr>
+                <w:noProof/>
+              </w:rPr>
+              <w:t xml:space="preserve">0.90</w:t>
+            </w:r>
+          </w:p>
+        </w:tc>
+        <w:tc>
+          <w:tcPr>
+            <w:tcBorders/>
+            <w:vAlign w:val="center"/>
+          </w:tcPr>
+          <w:p>
+            <w:pPr>
+              <w:pStyle w:val="TableText"/>
+              <w:jc w:val="right"/>
+            </w:pPr>
+            <w:r>
+              <w:rPr>
+                <w:noProof/>
+              </w:rPr>
+              <w:t xml:space="preserve">21/44</w:t>
+            </w:r>
+          </w:p>
+        </w:tc>
+      </w:tr>
+      <w:tr>
+        <w:trPr>
+          <w:cantSplit/>
+        </w:trPr>
+        <w:tc>
+          <w:tcPr>
             <w:tcBorders>
               <w:bottom w:val="single" w:sz="12" w:space="0" w:color="000000"/>
             </w:tcBorders>
@@ -23202,7 +23689,7 @@
               <w:rPr>
                 <w:noProof/>
               </w:rPr>
-              <w:t xml:space="preserve">五折电芯互斥</w:t>
+              <w:t xml:space="preserve">五折，复现实现，主干不含绝对电压水平特征</w:t>
             </w:r>
           </w:p>
         </w:tc>
@@ -23242,7 +23729,7 @@
               <w:rPr>
                 <w:noProof/>
               </w:rPr>
-              <w:t xml:space="preserve">2.030</w:t>
+              <w:t xml:space="preserve">1.940</w:t>
             </w:r>
           </w:p>
         </w:tc>
@@ -23262,7 +23749,7 @@
               <w:rPr>
                 <w:noProof/>
               </w:rPr>
-              <w:t xml:space="preserve">2.026</w:t>
+              <w:t xml:space="preserve">2.098</w:t>
             </w:r>
           </w:p>
         </w:tc>
@@ -23282,7 +23769,7 @@
               <w:rPr>
                 <w:noProof/>
               </w:rPr>
-              <w:t xml:space="preserve">2.317</w:t>
+              <w:t xml:space="preserve">—</w:t>
             </w:r>
           </w:p>
         </w:tc>
@@ -23302,7 +23789,7 @@
               <w:rPr>
                 <w:noProof/>
               </w:rPr>
-              <w:t xml:space="preserve">0.935</w:t>
+              <w:t xml:space="preserve">—</w:t>
             </w:r>
           </w:p>
         </w:tc>
@@ -23322,7 +23809,7 @@
               <w:rPr>
                 <w:noProof/>
               </w:rPr>
-              <w:t xml:space="preserve">+0.004</w:t>
+              <w:t xml:space="preserve">−0.158</w:t>
             </w:r>
           </w:p>
         </w:tc>
@@ -23342,7 +23829,7 @@
               <w:rPr>
                 <w:noProof/>
               </w:rPr>
-              <w:t xml:space="preserve">−0.042～0.047</w:t>
+              <w:t xml:space="preserve">−0.205～−0.112</w:t>
             </w:r>
           </w:p>
         </w:tc>
@@ -23362,7 +23849,7 @@
               <w:rPr>
                 <w:noProof/>
               </w:rPr>
-              <w:t xml:space="preserve">0.90</w:t>
+              <w:t xml:space="preserve">&lt;0.001</w:t>
             </w:r>
           </w:p>
         </w:tc>
@@ -23382,7 +23869,7 @@
               <w:rPr>
                 <w:noProof/>
               </w:rPr>
-              <w:t xml:space="preserve">21/44</w:t>
+              <w:t xml:space="preserve">36/44</w:t>
             </w:r>
           </w:p>
         </w:tc>
@@ -23405,7 +23892,31 @@
         <w:t xml:space="preserve"> </w:t>
       </w:r>
       <w:r>
-        <w:t xml:space="preserve">模型在无噪声数据上训练，仅在测试电压中加入噪声。留一工况组验证下各工况组的误差见正文图8a。</w:t>
+        <w:t xml:space="preserve">模型在无噪声数据上训练，仅在测试电压中加入噪声。</w:t>
+      </w:r>
+      <w:r>
+        <w:rPr>
+          <w:vertAlign w:val="superscript"/>
+        </w:rPr>
+        <w:t xml:space="preserve">b</w:t>
+      </w:r>
+      <w:r>
+        <w:t xml:space="preserve"> </w:t>
+      </w:r>
+      <w:r>
+        <w:t xml:space="preserve">原实现，A1单独加入直流内阻（补充说明S6）。</w:t>
+      </w:r>
+      <w:r>
+        <w:rPr>
+          <w:vertAlign w:val="superscript"/>
+        </w:rPr>
+        <w:t xml:space="preserve">c</w:t>
+      </w:r>
+      <w:r>
+        <w:t xml:space="preserve"> </w:t>
+      </w:r>
+      <w:r>
+        <w:t xml:space="preserve">Holm校正。留一工况组验证下各工况组的误差见正文图8a。</w:t>
       </w:r>
     </w:p>
     <w:bookmarkEnd w:id="27"/>
@@ -23433,7 +23944,7 @@
               <a:graphicData uri="http://schemas.openxmlformats.org/drawingml/2006/picture">
                 <pic:pic>
                   <pic:nvPicPr>
-                    <pic:cNvPr descr="figs/figS1_patch_cdf.png" id="30" name="Picture"/>
+                    <pic:cNvPr descr="figures/figS1_patch_cdf.png" id="30" name="Picture"/>
                     <pic:cNvPicPr>
                       <a:picLocks noChangeArrowheads="1" noChangeAspect="1"/>
                     </pic:cNvPicPr>
@@ -23498,7 +24009,7 @@
               <a:graphicData uri="http://schemas.openxmlformats.org/drawingml/2006/picture">
                 <pic:pic>
                   <pic:nvPicPr>
-                    <pic:cNvPr descr="figs/figS2_K.png" id="33" name="Picture"/>
+                    <pic:cNvPr descr="figures/figS2_K.png" id="33" name="Picture"/>
                     <pic:cNvPicPr>
                       <a:picLocks noChangeArrowheads="1" noChangeAspect="1"/>
                     </pic:cNvPicPr>
@@ -23586,7 +24097,7 @@
               <a:graphicData uri="http://schemas.openxmlformats.org/drawingml/2006/picture">
                 <pic:pic>
                   <pic:nvPicPr>
-                    <pic:cNvPr descr="figs/figS3_bias_soh.png" id="36" name="Picture"/>
+                    <pic:cNvPr descr="figures/figS3_bias_soh.png" id="36" name="Picture"/>
                     <pic:cNvPicPr>
                       <a:picLocks noChangeArrowheads="1" noChangeAspect="1"/>
                     </pic:cNvPicPr>
@@ -23651,7 +24162,7 @@
               <a:graphicData uri="http://schemas.openxmlformats.org/drawingml/2006/picture">
                 <pic:pic>
                   <pic:nvPicPr>
-                    <pic:cNvPr descr="figs/figS4_cells.png" id="39" name="Picture"/>
+                    <pic:cNvPr descr="figures/figS4_cells.png" id="39" name="Picture"/>
                     <pic:cNvPicPr>
                       <a:picLocks noChangeArrowheads="1" noChangeAspect="1"/>
                     </pic:cNvPicPr>
@@ -23716,7 +24227,7 @@
               <a:graphicData uri="http://schemas.openxmlformats.org/drawingml/2006/picture">
                 <pic:pic>
                   <pic:nvPicPr>
-                    <pic:cNvPr descr="figs/figS5_groups.png" id="42" name="Picture"/>
+                    <pic:cNvPr descr="figures/figS5_groups.png" id="42" name="Picture"/>
                     <pic:cNvPicPr>
                       <a:picLocks noChangeArrowheads="1" noChangeAspect="1"/>
                     </pic:cNvPicPr>

</xml_diff>